<commit_message>
ADDING TODAY'S WORK - 25.07.2026
</commit_message>
<xml_diff>
--- a/write_up/drafts/4_results/results_DRAFT_2.docx
+++ b/write_up/drafts/4_results/results_DRAFT_2.docx
@@ -438,6 +438,46 @@
     <w:p/>
     <w:p/>
     <w:p>
+      <w:r>
+        <w:lastRenderedPageBreak/>
+        <w:drawing>
+          <wp:inline distT="0" distB="0" distL="0" distR="0" wp14:anchorId="7DC90B55" wp14:editId="4DD27A0E">
+            <wp:extent cx="4820653" cy="5623918"/>
+            <wp:effectExtent l="0" t="0" r="5715" b="2540"/>
+            <wp:docPr id="133904676" name="Picture 1"/>
+            <wp:cNvGraphicFramePr>
+              <a:graphicFrameLocks xmlns:a="http://schemas.openxmlformats.org/drawingml/2006/main" noChangeAspect="1"/>
+            </wp:cNvGraphicFramePr>
+            <a:graphic xmlns:a="http://schemas.openxmlformats.org/drawingml/2006/main">
+              <a:graphicData uri="http://schemas.openxmlformats.org/drawingml/2006/picture">
+                <pic:pic xmlns:pic="http://schemas.openxmlformats.org/drawingml/2006/picture">
+                  <pic:nvPicPr>
+                    <pic:cNvPr id="133904676" name=""/>
+                    <pic:cNvPicPr/>
+                  </pic:nvPicPr>
+                  <pic:blipFill>
+                    <a:blip r:embed="rId5"/>
+                    <a:stretch>
+                      <a:fillRect/>
+                    </a:stretch>
+                  </pic:blipFill>
+                  <pic:spPr>
+                    <a:xfrm>
+                      <a:off x="0" y="0"/>
+                      <a:ext cx="4837761" cy="5643877"/>
+                    </a:xfrm>
+                    <a:prstGeom prst="rect">
+                      <a:avLst/>
+                    </a:prstGeom>
+                  </pic:spPr>
+                </pic:pic>
+              </a:graphicData>
+            </a:graphic>
+          </wp:inline>
+        </w:drawing>
+      </w:r>
+    </w:p>
+    <w:p>
       <w:pPr>
         <w:pStyle w:val="ListParagraph"/>
         <w:numPr>
@@ -591,48 +631,48 @@
       </w:r>
       <w:proofErr w:type="spellEnd"/>
       <w:r>
-        <w:t xml:space="preserve">/cm² had the highest </w:t>
+        <w:t xml:space="preserve">/cm² had the highest mean (74,738) </w:t>
+      </w:r>
+      <w:r>
+        <w:t>(</w:t>
+      </w:r>
+      <w:r>
+        <w:t xml:space="preserve">Supp Figure [1a]). </w:t>
+      </w:r>
+      <w:r>
+        <w:t xml:space="preserve">However, the number of reads assigned to miRNAs did not show a clear dose-dependent trend, with the 0.005 </w:t>
+      </w:r>
+      <w:proofErr w:type="spellStart"/>
+      <w:r>
+        <w:t>μg</w:t>
+      </w:r>
+      <w:proofErr w:type="spellEnd"/>
+      <w:r>
+        <w:t xml:space="preserve">/cm² group having the second-highest mean, followed by the 0.08 and 2 </w:t>
+      </w:r>
+      <w:proofErr w:type="spellStart"/>
+      <w:r>
+        <w:t>μg</w:t>
+      </w:r>
+      <w:proofErr w:type="spellEnd"/>
+      <w:r>
+        <w:t>/cm² groups</w:t>
+      </w:r>
+      <w:r>
+        <w:t xml:space="preserve">, </w:t>
+      </w:r>
+      <w:r>
+        <w:t>respectively.</w:t>
+      </w:r>
+      <w:r>
+        <w:t xml:space="preserve"> </w:t>
+      </w:r>
+      <w:r>
+        <w:t xml:space="preserve">The </w:t>
       </w:r>
       <w:r>
         <w:lastRenderedPageBreak/>
-        <w:t xml:space="preserve">mean (74,738) </w:t>
-      </w:r>
-      <w:r>
-        <w:t>(</w:t>
-      </w:r>
-      <w:r>
-        <w:t xml:space="preserve">Supp Figure [1a]). </w:t>
-      </w:r>
-      <w:r>
-        <w:t xml:space="preserve">However, the number of reads assigned to miRNAs did not show a clear dose-dependent trend, with the 0.005 </w:t>
-      </w:r>
-      <w:proofErr w:type="spellStart"/>
-      <w:r>
-        <w:t>μg</w:t>
-      </w:r>
-      <w:proofErr w:type="spellEnd"/>
-      <w:r>
-        <w:t xml:space="preserve">/cm² group having the second-highest mean, followed by the 0.08 and 2 </w:t>
-      </w:r>
-      <w:proofErr w:type="spellStart"/>
-      <w:r>
-        <w:t>μg</w:t>
-      </w:r>
-      <w:proofErr w:type="spellEnd"/>
-      <w:r>
-        <w:t>/cm² groups</w:t>
-      </w:r>
-      <w:r>
-        <w:t xml:space="preserve">, </w:t>
-      </w:r>
-      <w:r>
-        <w:t>respectively.</w:t>
-      </w:r>
-      <w:r>
-        <w:t xml:space="preserve"> </w:t>
-      </w:r>
-      <w:r>
-        <w:t xml:space="preserve">The elevated mean in the 0.005 </w:t>
+        <w:t xml:space="preserve">elevated mean in the 0.005 </w:t>
       </w:r>
       <w:proofErr w:type="spellStart"/>
       <w:r>
@@ -849,25 +889,25 @@
       </w:r>
       <w:proofErr w:type="spellEnd"/>
       <w:r>
-        <w:t xml:space="preserve"> to identify differentially expressed miRNAs between treated </w:t>
+        <w:t xml:space="preserve"> to identify differentially expressed miRNAs between treated and untreated primary HBEC samples and Calu-3 samples. In primary HBECs, 147 of the 562 miRNAs detected across all protease exposure conditions were retained following removal of lowly expressed miRNAs. In the 24 </w:t>
+      </w:r>
+      <w:proofErr w:type="spellStart"/>
+      <w:r>
+        <w:t>μg</w:t>
+      </w:r>
+      <w:proofErr w:type="spellEnd"/>
+      <w:r>
+        <w:t>/cm² exposure group, 2</w:t>
+      </w:r>
+      <w:r>
+        <w:t>7</w:t>
+      </w:r>
+      <w:r>
+        <w:t xml:space="preserve"> </w:t>
       </w:r>
       <w:r>
         <w:lastRenderedPageBreak/>
-        <w:t xml:space="preserve">and untreated primary HBEC samples and Calu-3 samples. In primary HBECs, 147 of the 562 miRNAs detected across all protease exposure conditions were retained following removal of lowly expressed miRNAs. In the 24 </w:t>
-      </w:r>
-      <w:proofErr w:type="spellStart"/>
-      <w:r>
-        <w:t>μg</w:t>
-      </w:r>
-      <w:proofErr w:type="spellEnd"/>
-      <w:r>
-        <w:t>/cm² exposure group, 2</w:t>
-      </w:r>
-      <w:r>
-        <w:t>7</w:t>
-      </w:r>
-      <w:r>
-        <w:t xml:space="preserve"> miRNAs were significantly differentially expressed based on |</w:t>
+        <w:t>miRNAs were significantly differentially expressed based on |</w:t>
       </w:r>
       <w:proofErr w:type="spellStart"/>
       <w:r>
@@ -1021,24 +1061,27 @@
     <w:p/>
     <w:p>
       <w:r>
+        <w:t xml:space="preserve">The distribution of differential expression in the 24 </w:t>
+      </w:r>
+      <w:proofErr w:type="spellStart"/>
+      <w:r>
+        <w:t>μg</w:t>
+      </w:r>
+      <w:proofErr w:type="spellEnd"/>
+      <w:r>
+        <w:t>/cm² protease-treated primary HBEC samples was visualised using an MA plot, while statistical significance was displayed using a volcano plot (Figure 4</w:t>
+      </w:r>
+      <w:proofErr w:type="gramStart"/>
+      <w:r>
+        <w:t>d,e</w:t>
+      </w:r>
+      <w:proofErr w:type="gramEnd"/>
+      <w:r>
+        <w:t xml:space="preserve">). Of the 27 differentially expressed miRNAs, </w:t>
+      </w:r>
+      <w:r>
         <w:lastRenderedPageBreak/>
-        <w:t xml:space="preserve">The distribution of differential expression in the 24 </w:t>
-      </w:r>
-      <w:proofErr w:type="spellStart"/>
-      <w:r>
-        <w:t>μg</w:t>
-      </w:r>
-      <w:proofErr w:type="spellEnd"/>
-      <w:r>
-        <w:t>/cm² protease-treated primary HBEC samples was visualised using an MA plot, while statistical significance was displayed using a volcano plot (Figure 4</w:t>
-      </w:r>
-      <w:proofErr w:type="gramStart"/>
-      <w:r>
-        <w:t>d,e</w:t>
-      </w:r>
-      <w:proofErr w:type="gramEnd"/>
-      <w:r>
-        <w:t xml:space="preserve">). Of the 27 differentially expressed miRNAs, 13 showed higher expression in the 24 </w:t>
+        <w:t xml:space="preserve">13 showed higher expression in the 24 </w:t>
       </w:r>
       <w:proofErr w:type="spellStart"/>
       <w:r>
@@ -1490,7 +1533,6 @@
           <w:i/>
           <w:iCs/>
         </w:rPr>
-        <w:lastRenderedPageBreak/>
         <w:t>Transcriptional activation of cell cycle inhibitor p2</w:t>
       </w:r>
       <w:r>
@@ -1545,6 +1587,7 @@
         <w:t xml:space="preserve">miRNA-SEA was </w:t>
       </w:r>
       <w:r>
+        <w:lastRenderedPageBreak/>
         <w:t xml:space="preserve">subsequently </w:t>
       </w:r>
       <w:r>
@@ -1680,7 +1723,6 @@
     </w:p>
     <w:p>
       <w:r>
-        <w:lastRenderedPageBreak/>
         <w:t xml:space="preserve">Overall, substantially more publications were identified for miR-125b-5p than for miR-574-5p. Notably, miR-125b-5p was also the only differentially expressed miRNA observed in both the 24 </w:t>
       </w:r>
       <w:proofErr w:type="spellStart"/>

</xml_diff>